<commit_message>
Replacing avg module after extensive unsuccessful debugging on an excessively complicated version.
</commit_message>
<xml_diff>
--- a/docs/Block_Summary.docx
+++ b/docs/Block_Summary.docx
@@ -2619,17 +2619,13 @@
         <w:br/>
       </w:r>
       <w:r>
-        <w:t xml:space="preserve">Word 0: [31:16] </w:t>
-      </w:r>
-      <w:r>
-        <w:t>speed_rpm_slow</w:t>
-      </w:r>
-      <w:r>
-        <w:t xml:space="preserve"> [15:0] speed_rpm_fast</w:t>
-      </w:r>
-      <w:r>
-        <w:br/>
-        <w:t xml:space="preserve">Word 1: [31:0] </w:t>
+        <w:t xml:space="preserve">Word </w:t>
+      </w:r>
+      <w:r>
+        <w:t>0</w:t>
+      </w:r>
+      <w:r>
+        <w:t xml:space="preserve">: [31:0] </w:t>
       </w:r>
       <w:r>
         <w:t>tdc_deg (0-7199 value representing 0.0-719.99deg)</w:t>
@@ -2641,7 +2637,7 @@
         <w:t xml:space="preserve">Word </w:t>
       </w:r>
       <w:r>
-        <w:t>2</w:t>
+        <w:t>1</w:t>
       </w:r>
       <w:r>
         <w:t>: [31:</w:t>
@@ -2656,43 +2652,10 @@
         <w:t>0</w:t>
       </w:r>
       <w:r>
-        <w:t>] ADC_ch1</w:t>
-      </w:r>
-      <w:r>
-        <w:br/>
-      </w:r>
-      <w:r>
-        <w:t xml:space="preserve">Word </w:t>
-      </w:r>
-      <w:r>
-        <w:t>3</w:t>
-      </w:r>
-      <w:r>
-        <w:t>: [31:16] ADC_ch2 [15:0] ADC_ch3</w:t>
-      </w:r>
-      <w:r>
-        <w:br/>
-      </w:r>
-      <w:r>
-        <w:t xml:space="preserve">Word </w:t>
-      </w:r>
-      <w:r>
-        <w:t>4</w:t>
-      </w:r>
-      <w:r>
-        <w:t>: [31:16] ADC_ch4 [15:0] ADC_ch5</w:t>
-      </w:r>
-      <w:r>
-        <w:br/>
-      </w:r>
-      <w:r>
-        <w:t xml:space="preserve">Word </w:t>
-      </w:r>
-      <w:r>
-        <w:t>5</w:t>
-      </w:r>
-      <w:r>
-        <w:t>: [31:16] ADC_ch6 [15:0] reserved</w:t>
+        <w:t>] ADC_ch</w:t>
+      </w:r>
+      <w:r>
+        <w:t>0</w:t>
       </w:r>
     </w:p>
     <w:p>
@@ -3215,33 +3178,35 @@
         </w:numPr>
       </w:pPr>
       <w:r>
+        <w:t>if ref_sel = 1, gate cam faults</w:t>
+      </w:r>
+      <w:r>
+        <w:br/>
+      </w:r>
+    </w:p>
+    <w:p>
+      <w:r>
+        <w:rPr>
+          <w:b/>
+          <w:bCs/>
+        </w:rPr>
+        <w:t>axi config:</w:t>
+      </w:r>
+      <w:r>
+        <w:t xml:space="preserve"> cam_n_teeth (number of cam teeth per 2 crank revs)</w:t>
+      </w:r>
+      <w:r>
+        <w:tab/>
+      </w:r>
+      <w:r>
+        <w:br/>
+        <w:t xml:space="preserve">                        crank_n_teeth</w:t>
+      </w:r>
+      <w:r>
+        <w:br/>
+      </w:r>
+      <w:r>
         <w:lastRenderedPageBreak/>
-        <w:t>if ref_sel = 1, gate cam faults</w:t>
-      </w:r>
-      <w:r>
-        <w:br/>
-      </w:r>
-    </w:p>
-    <w:p>
-      <w:r>
-        <w:rPr>
-          <w:b/>
-          <w:bCs/>
-        </w:rPr>
-        <w:t>axi config:</w:t>
-      </w:r>
-      <w:r>
-        <w:t xml:space="preserve"> cam_n_teeth (number of cam teeth per 2 crank revs)</w:t>
-      </w:r>
-      <w:r>
-        <w:tab/>
-      </w:r>
-      <w:r>
-        <w:br/>
-        <w:t xml:space="preserve">                        crank_n_teeth</w:t>
-      </w:r>
-      <w:r>
-        <w:br/>
         <w:t xml:space="preserve">                        crank_n_missing</w:t>
       </w:r>
       <w:r>
@@ -3576,7 +3541,6 @@
           <w:szCs w:val="36"/>
           <w:u w:val="single"/>
         </w:rPr>
-        <w:lastRenderedPageBreak/>
         <w:br/>
       </w:r>
     </w:p>

</xml_diff>